<commit_message>
Match linking-words exercise to reference template
</commit_message>
<xml_diff>
--- a/deliverables/PET_Free_Time_Review.docx
+++ b/deliverables/PET_Free_Time_Review.docx
@@ -784,9 +784,9 @@
             <w:vAlign w:val="center"/>
             <w:shd w:fill="367DB1"/>
             <w:tcMar>
-              <w:top w:w="85" w:type="dxa"/>
+              <w:top w:w="50" w:type="dxa"/>
               <w:left w:w="100" w:type="dxa"/>
-              <w:bottom w:w="85" w:type="dxa"/>
+              <w:bottom w:w="50" w:type="dxa"/>
               <w:right w:w="100" w:type="dxa"/>
             </w:tcMar>
           </w:tcPr>
@@ -810,9 +810,9 @@
             <w:vAlign w:val="center"/>
             <w:shd w:fill="367DB1"/>
             <w:tcMar>
-              <w:top w:w="85" w:type="dxa"/>
+              <w:top w:w="50" w:type="dxa"/>
               <w:left w:w="100" w:type="dxa"/>
-              <w:bottom w:w="85" w:type="dxa"/>
+              <w:bottom w:w="50" w:type="dxa"/>
               <w:right w:w="100" w:type="dxa"/>
             </w:tcMar>
           </w:tcPr>
@@ -841,9 +841,9 @@
             <w:vAlign w:val="center"/>
             <w:shd w:fill="EEF5FB"/>
             <w:tcMar>
-              <w:top w:w="85" w:type="dxa"/>
+              <w:top w:w="50" w:type="dxa"/>
               <w:left w:w="100" w:type="dxa"/>
-              <w:bottom w:w="85" w:type="dxa"/>
+              <w:bottom w:w="50" w:type="dxa"/>
               <w:right w:w="100" w:type="dxa"/>
             </w:tcMar>
           </w:tcPr>
@@ -867,9 +867,9 @@
             <w:vAlign w:val="center"/>
             <w:shd w:fill="EEF5FB"/>
             <w:tcMar>
-              <w:top w:w="85" w:type="dxa"/>
+              <w:top w:w="50" w:type="dxa"/>
               <w:left w:w="100" w:type="dxa"/>
-              <w:bottom w:w="85" w:type="dxa"/>
+              <w:bottom w:w="50" w:type="dxa"/>
               <w:right w:w="100" w:type="dxa"/>
             </w:tcMar>
           </w:tcPr>
@@ -898,9 +898,9 @@
             <w:vAlign w:val="center"/>
             <w:shd w:fill="FFFFFF"/>
             <w:tcMar>
-              <w:top w:w="85" w:type="dxa"/>
+              <w:top w:w="50" w:type="dxa"/>
               <w:left w:w="100" w:type="dxa"/>
-              <w:bottom w:w="85" w:type="dxa"/>
+              <w:bottom w:w="50" w:type="dxa"/>
               <w:right w:w="100" w:type="dxa"/>
             </w:tcMar>
           </w:tcPr>
@@ -924,9 +924,9 @@
             <w:vAlign w:val="center"/>
             <w:shd w:fill="FFFFFF"/>
             <w:tcMar>
-              <w:top w:w="85" w:type="dxa"/>
+              <w:top w:w="50" w:type="dxa"/>
               <w:left w:w="100" w:type="dxa"/>
-              <w:bottom w:w="85" w:type="dxa"/>
+              <w:bottom w:w="50" w:type="dxa"/>
               <w:right w:w="100" w:type="dxa"/>
             </w:tcMar>
           </w:tcPr>
@@ -978,9 +978,9 @@
             <w:vAlign w:val="center"/>
             <w:shd w:fill="367DB1"/>
             <w:tcMar>
-              <w:top w:w="85" w:type="dxa"/>
+              <w:top w:w="50" w:type="dxa"/>
               <w:left w:w="100" w:type="dxa"/>
-              <w:bottom w:w="85" w:type="dxa"/>
+              <w:bottom w:w="50" w:type="dxa"/>
               <w:right w:w="100" w:type="dxa"/>
             </w:tcMar>
           </w:tcPr>
@@ -1004,9 +1004,9 @@
             <w:vAlign w:val="center"/>
             <w:shd w:fill="367DB1"/>
             <w:tcMar>
-              <w:top w:w="85" w:type="dxa"/>
+              <w:top w:w="50" w:type="dxa"/>
               <w:left w:w="100" w:type="dxa"/>
-              <w:bottom w:w="85" w:type="dxa"/>
+              <w:bottom w:w="50" w:type="dxa"/>
               <w:right w:w="100" w:type="dxa"/>
             </w:tcMar>
           </w:tcPr>
@@ -1035,9 +1035,9 @@
             <w:vAlign w:val="center"/>
             <w:shd w:fill="EEF5FB"/>
             <w:tcMar>
-              <w:top w:w="85" w:type="dxa"/>
+              <w:top w:w="50" w:type="dxa"/>
               <w:left w:w="100" w:type="dxa"/>
-              <w:bottom w:w="85" w:type="dxa"/>
+              <w:bottom w:w="50" w:type="dxa"/>
               <w:right w:w="100" w:type="dxa"/>
             </w:tcMar>
           </w:tcPr>
@@ -1061,9 +1061,9 @@
             <w:vAlign w:val="center"/>
             <w:shd w:fill="EEF5FB"/>
             <w:tcMar>
-              <w:top w:w="85" w:type="dxa"/>
+              <w:top w:w="50" w:type="dxa"/>
               <w:left w:w="100" w:type="dxa"/>
-              <w:bottom w:w="85" w:type="dxa"/>
+              <w:bottom w:w="50" w:type="dxa"/>
               <w:right w:w="100" w:type="dxa"/>
             </w:tcMar>
           </w:tcPr>
@@ -1092,9 +1092,9 @@
             <w:vAlign w:val="center"/>
             <w:shd w:fill="FFFFFF"/>
             <w:tcMar>
-              <w:top w:w="85" w:type="dxa"/>
+              <w:top w:w="50" w:type="dxa"/>
               <w:left w:w="100" w:type="dxa"/>
-              <w:bottom w:w="85" w:type="dxa"/>
+              <w:bottom w:w="50" w:type="dxa"/>
               <w:right w:w="100" w:type="dxa"/>
             </w:tcMar>
           </w:tcPr>
@@ -1118,9 +1118,9 @@
             <w:vAlign w:val="center"/>
             <w:shd w:fill="FFFFFF"/>
             <w:tcMar>
-              <w:top w:w="85" w:type="dxa"/>
+              <w:top w:w="50" w:type="dxa"/>
               <w:left w:w="100" w:type="dxa"/>
-              <w:bottom w:w="85" w:type="dxa"/>
+              <w:bottom w:w="50" w:type="dxa"/>
               <w:right w:w="100" w:type="dxa"/>
             </w:tcMar>
           </w:tcPr>
@@ -1149,9 +1149,9 @@
             <w:vAlign w:val="center"/>
             <w:shd w:fill="EEF5FB"/>
             <w:tcMar>
-              <w:top w:w="85" w:type="dxa"/>
+              <w:top w:w="50" w:type="dxa"/>
               <w:left w:w="100" w:type="dxa"/>
-              <w:bottom w:w="85" w:type="dxa"/>
+              <w:bottom w:w="50" w:type="dxa"/>
               <w:right w:w="100" w:type="dxa"/>
             </w:tcMar>
           </w:tcPr>
@@ -1175,9 +1175,9 @@
             <w:vAlign w:val="center"/>
             <w:shd w:fill="EEF5FB"/>
             <w:tcMar>
-              <w:top w:w="85" w:type="dxa"/>
+              <w:top w:w="50" w:type="dxa"/>
               <w:left w:w="100" w:type="dxa"/>
-              <w:bottom w:w="85" w:type="dxa"/>
+              <w:bottom w:w="50" w:type="dxa"/>
               <w:right w:w="100" w:type="dxa"/>
             </w:tcMar>
           </w:tcPr>
@@ -1229,9 +1229,9 @@
             <w:vAlign w:val="center"/>
             <w:shd w:fill="367DB1"/>
             <w:tcMar>
-              <w:top w:w="85" w:type="dxa"/>
+              <w:top w:w="50" w:type="dxa"/>
               <w:left w:w="100" w:type="dxa"/>
-              <w:bottom w:w="85" w:type="dxa"/>
+              <w:bottom w:w="50" w:type="dxa"/>
               <w:right w:w="100" w:type="dxa"/>
             </w:tcMar>
           </w:tcPr>
@@ -1255,9 +1255,9 @@
             <w:vAlign w:val="center"/>
             <w:shd w:fill="367DB1"/>
             <w:tcMar>
-              <w:top w:w="85" w:type="dxa"/>
+              <w:top w:w="50" w:type="dxa"/>
               <w:left w:w="100" w:type="dxa"/>
-              <w:bottom w:w="85" w:type="dxa"/>
+              <w:bottom w:w="50" w:type="dxa"/>
               <w:right w:w="100" w:type="dxa"/>
             </w:tcMar>
           </w:tcPr>
@@ -1286,9 +1286,9 @@
             <w:vAlign w:val="center"/>
             <w:shd w:fill="EEF5FB"/>
             <w:tcMar>
-              <w:top w:w="85" w:type="dxa"/>
+              <w:top w:w="50" w:type="dxa"/>
               <w:left w:w="100" w:type="dxa"/>
-              <w:bottom w:w="85" w:type="dxa"/>
+              <w:bottom w:w="50" w:type="dxa"/>
               <w:right w:w="100" w:type="dxa"/>
             </w:tcMar>
           </w:tcPr>
@@ -1312,9 +1312,9 @@
             <w:vAlign w:val="center"/>
             <w:shd w:fill="EEF5FB"/>
             <w:tcMar>
-              <w:top w:w="85" w:type="dxa"/>
+              <w:top w:w="50" w:type="dxa"/>
               <w:left w:w="100" w:type="dxa"/>
-              <w:bottom w:w="85" w:type="dxa"/>
+              <w:bottom w:w="50" w:type="dxa"/>
               <w:right w:w="100" w:type="dxa"/>
             </w:tcMar>
           </w:tcPr>
@@ -1343,9 +1343,9 @@
             <w:vAlign w:val="center"/>
             <w:shd w:fill="FFFFFF"/>
             <w:tcMar>
-              <w:top w:w="85" w:type="dxa"/>
+              <w:top w:w="50" w:type="dxa"/>
               <w:left w:w="100" w:type="dxa"/>
-              <w:bottom w:w="85" w:type="dxa"/>
+              <w:bottom w:w="50" w:type="dxa"/>
               <w:right w:w="100" w:type="dxa"/>
             </w:tcMar>
           </w:tcPr>
@@ -1369,9 +1369,9 @@
             <w:vAlign w:val="center"/>
             <w:shd w:fill="FFFFFF"/>
             <w:tcMar>
-              <w:top w:w="85" w:type="dxa"/>
+              <w:top w:w="50" w:type="dxa"/>
               <w:left w:w="100" w:type="dxa"/>
-              <w:bottom w:w="85" w:type="dxa"/>
+              <w:bottom w:w="50" w:type="dxa"/>
               <w:right w:w="100" w:type="dxa"/>
             </w:tcMar>
           </w:tcPr>
@@ -1400,9 +1400,9 @@
             <w:vAlign w:val="center"/>
             <w:shd w:fill="EEF5FB"/>
             <w:tcMar>
-              <w:top w:w="85" w:type="dxa"/>
+              <w:top w:w="50" w:type="dxa"/>
               <w:left w:w="100" w:type="dxa"/>
-              <w:bottom w:w="85" w:type="dxa"/>
+              <w:bottom w:w="50" w:type="dxa"/>
               <w:right w:w="100" w:type="dxa"/>
             </w:tcMar>
           </w:tcPr>
@@ -1426,9 +1426,9 @@
             <w:vAlign w:val="center"/>
             <w:shd w:fill="EEF5FB"/>
             <w:tcMar>
-              <w:top w:w="85" w:type="dxa"/>
+              <w:top w:w="50" w:type="dxa"/>
               <w:left w:w="100" w:type="dxa"/>
-              <w:bottom w:w="85" w:type="dxa"/>
+              <w:bottom w:w="50" w:type="dxa"/>
               <w:right w:w="100" w:type="dxa"/>
             </w:tcMar>
           </w:tcPr>
@@ -1457,9 +1457,9 @@
             <w:vAlign w:val="center"/>
             <w:shd w:fill="FFFFFF"/>
             <w:tcMar>
-              <w:top w:w="85" w:type="dxa"/>
+              <w:top w:w="50" w:type="dxa"/>
               <w:left w:w="100" w:type="dxa"/>
-              <w:bottom w:w="85" w:type="dxa"/>
+              <w:bottom w:w="50" w:type="dxa"/>
               <w:right w:w="100" w:type="dxa"/>
             </w:tcMar>
           </w:tcPr>
@@ -1483,9 +1483,9 @@
             <w:vAlign w:val="center"/>
             <w:shd w:fill="FFFFFF"/>
             <w:tcMar>
-              <w:top w:w="85" w:type="dxa"/>
+              <w:top w:w="50" w:type="dxa"/>
               <w:left w:w="100" w:type="dxa"/>
-              <w:bottom w:w="85" w:type="dxa"/>
+              <w:bottom w:w="50" w:type="dxa"/>
               <w:right w:w="100" w:type="dxa"/>
             </w:tcMar>
           </w:tcPr>
@@ -1538,7 +1538,7 @@
         <w:rPr>
           <w:b w:val="0"/>
         </w:rPr>
-        <w:t>本题主要用到原因、举例、补充和结果；不需要为了展示词汇而全部使用。</w:t>
+        <w:t>本题用原因、举例、补充和结果解释活动；firstly / finally 可安排观点顺序。</w:t>
       </w:r>
     </w:p>
     <w:tbl>
@@ -1564,9 +1564,9 @@
             <w:vAlign w:val="center"/>
             <w:shd w:fill="367DB1"/>
             <w:tcMar>
-              <w:top w:w="85" w:type="dxa"/>
+              <w:top w:w="50" w:type="dxa"/>
               <w:left w:w="100" w:type="dxa"/>
-              <w:bottom w:w="85" w:type="dxa"/>
+              <w:bottom w:w="50" w:type="dxa"/>
               <w:right w:w="100" w:type="dxa"/>
             </w:tcMar>
           </w:tcPr>
@@ -1590,9 +1590,9 @@
             <w:vAlign w:val="center"/>
             <w:shd w:fill="367DB1"/>
             <w:tcMar>
-              <w:top w:w="85" w:type="dxa"/>
+              <w:top w:w="50" w:type="dxa"/>
               <w:left w:w="100" w:type="dxa"/>
-              <w:bottom w:w="85" w:type="dxa"/>
+              <w:bottom w:w="50" w:type="dxa"/>
               <w:right w:w="100" w:type="dxa"/>
             </w:tcMar>
           </w:tcPr>
@@ -1616,9 +1616,9 @@
             <w:vAlign w:val="center"/>
             <w:shd w:fill="367DB1"/>
             <w:tcMar>
-              <w:top w:w="85" w:type="dxa"/>
+              <w:top w:w="50" w:type="dxa"/>
               <w:left w:w="100" w:type="dxa"/>
-              <w:bottom w:w="85" w:type="dxa"/>
+              <w:bottom w:w="50" w:type="dxa"/>
               <w:right w:w="100" w:type="dxa"/>
             </w:tcMar>
           </w:tcPr>
@@ -1647,9 +1647,9 @@
             <w:vAlign w:val="center"/>
             <w:shd w:fill="EEF5FB"/>
             <w:tcMar>
-              <w:top w:w="85" w:type="dxa"/>
+              <w:top w:w="50" w:type="dxa"/>
               <w:left w:w="100" w:type="dxa"/>
-              <w:bottom w:w="85" w:type="dxa"/>
+              <w:bottom w:w="50" w:type="dxa"/>
               <w:right w:w="100" w:type="dxa"/>
             </w:tcMar>
           </w:tcPr>
@@ -1673,9 +1673,9 @@
             <w:vAlign w:val="center"/>
             <w:shd w:fill="EEF5FB"/>
             <w:tcMar>
-              <w:top w:w="85" w:type="dxa"/>
+              <w:top w:w="50" w:type="dxa"/>
               <w:left w:w="100" w:type="dxa"/>
-              <w:bottom w:w="85" w:type="dxa"/>
+              <w:bottom w:w="50" w:type="dxa"/>
               <w:right w:w="100" w:type="dxa"/>
             </w:tcMar>
           </w:tcPr>
@@ -1699,9 +1699,9 @@
             <w:vAlign w:val="center"/>
             <w:shd w:fill="EEF5FB"/>
             <w:tcMar>
-              <w:top w:w="85" w:type="dxa"/>
+              <w:top w:w="50" w:type="dxa"/>
               <w:left w:w="100" w:type="dxa"/>
-              <w:bottom w:w="85" w:type="dxa"/>
+              <w:bottom w:w="50" w:type="dxa"/>
               <w:right w:w="100" w:type="dxa"/>
             </w:tcMar>
           </w:tcPr>
@@ -1730,9 +1730,9 @@
             <w:vAlign w:val="center"/>
             <w:shd w:fill="FFFFFF"/>
             <w:tcMar>
-              <w:top w:w="85" w:type="dxa"/>
+              <w:top w:w="50" w:type="dxa"/>
               <w:left w:w="100" w:type="dxa"/>
-              <w:bottom w:w="85" w:type="dxa"/>
+              <w:bottom w:w="50" w:type="dxa"/>
               <w:right w:w="100" w:type="dxa"/>
             </w:tcMar>
           </w:tcPr>
@@ -1756,9 +1756,9 @@
             <w:vAlign w:val="center"/>
             <w:shd w:fill="FFFFFF"/>
             <w:tcMar>
-              <w:top w:w="85" w:type="dxa"/>
+              <w:top w:w="50" w:type="dxa"/>
               <w:left w:w="100" w:type="dxa"/>
-              <w:bottom w:w="85" w:type="dxa"/>
+              <w:bottom w:w="50" w:type="dxa"/>
               <w:right w:w="100" w:type="dxa"/>
             </w:tcMar>
           </w:tcPr>
@@ -1784,9 +1784,9 @@
             <w:vAlign w:val="center"/>
             <w:shd w:fill="FFFFFF"/>
             <w:tcMar>
-              <w:top w:w="85" w:type="dxa"/>
+              <w:top w:w="50" w:type="dxa"/>
               <w:left w:w="100" w:type="dxa"/>
-              <w:bottom w:w="85" w:type="dxa"/>
+              <w:bottom w:w="50" w:type="dxa"/>
               <w:right w:w="100" w:type="dxa"/>
             </w:tcMar>
           </w:tcPr>
@@ -1815,9 +1815,9 @@
             <w:vAlign w:val="center"/>
             <w:shd w:fill="EEF5FB"/>
             <w:tcMar>
-              <w:top w:w="85" w:type="dxa"/>
+              <w:top w:w="50" w:type="dxa"/>
               <w:left w:w="100" w:type="dxa"/>
-              <w:bottom w:w="85" w:type="dxa"/>
+              <w:bottom w:w="50" w:type="dxa"/>
               <w:right w:w="100" w:type="dxa"/>
             </w:tcMar>
           </w:tcPr>
@@ -1841,9 +1841,9 @@
             <w:vAlign w:val="center"/>
             <w:shd w:fill="EEF5FB"/>
             <w:tcMar>
-              <w:top w:w="85" w:type="dxa"/>
+              <w:top w:w="50" w:type="dxa"/>
               <w:left w:w="100" w:type="dxa"/>
-              <w:bottom w:w="85" w:type="dxa"/>
+              <w:bottom w:w="50" w:type="dxa"/>
               <w:right w:w="100" w:type="dxa"/>
             </w:tcMar>
           </w:tcPr>
@@ -1869,9 +1869,9 @@
             <w:vAlign w:val="center"/>
             <w:shd w:fill="EEF5FB"/>
             <w:tcMar>
-              <w:top w:w="85" w:type="dxa"/>
+              <w:top w:w="50" w:type="dxa"/>
               <w:left w:w="100" w:type="dxa"/>
-              <w:bottom w:w="85" w:type="dxa"/>
+              <w:bottom w:w="50" w:type="dxa"/>
               <w:right w:w="100" w:type="dxa"/>
             </w:tcMar>
           </w:tcPr>
@@ -1902,9 +1902,9 @@
             <w:vAlign w:val="center"/>
             <w:shd w:fill="FFFFFF"/>
             <w:tcMar>
-              <w:top w:w="85" w:type="dxa"/>
+              <w:top w:w="50" w:type="dxa"/>
               <w:left w:w="100" w:type="dxa"/>
-              <w:bottom w:w="85" w:type="dxa"/>
+              <w:bottom w:w="50" w:type="dxa"/>
               <w:right w:w="100" w:type="dxa"/>
             </w:tcMar>
           </w:tcPr>
@@ -1928,9 +1928,9 @@
             <w:vAlign w:val="center"/>
             <w:shd w:fill="FFFFFF"/>
             <w:tcMar>
-              <w:top w:w="85" w:type="dxa"/>
+              <w:top w:w="50" w:type="dxa"/>
               <w:left w:w="100" w:type="dxa"/>
-              <w:bottom w:w="85" w:type="dxa"/>
+              <w:bottom w:w="50" w:type="dxa"/>
               <w:right w:w="100" w:type="dxa"/>
             </w:tcMar>
           </w:tcPr>
@@ -1954,9 +1954,9 @@
             <w:vAlign w:val="center"/>
             <w:shd w:fill="FFFFFF"/>
             <w:tcMar>
-              <w:top w:w="85" w:type="dxa"/>
+              <w:top w:w="50" w:type="dxa"/>
               <w:left w:w="100" w:type="dxa"/>
-              <w:bottom w:w="85" w:type="dxa"/>
+              <w:bottom w:w="50" w:type="dxa"/>
               <w:right w:w="100" w:type="dxa"/>
             </w:tcMar>
           </w:tcPr>
@@ -1971,6 +1971,96 @@
                 <w:sz w:val="20"/>
               </w:rPr>
               <w:t>There are courts nearby, so they can play there.</w:t>
+            </w:r>
+          </w:p>
+        </w:tc>
+      </w:tr>
+      <w:tr>
+        <w:trPr>
+          <w:cantSplit/>
+        </w:trPr>
+        <w:tc>
+          <w:tcPr>
+            <w:tcW w:type="dxa" w:w="1134"/>
+            <w:vAlign w:val="center"/>
+            <w:shd w:fill="EEF5FB"/>
+            <w:tcMar>
+              <w:top w:w="50" w:type="dxa"/>
+              <w:left w:w="100" w:type="dxa"/>
+              <w:bottom w:w="50" w:type="dxa"/>
+              <w:right w:w="100" w:type="dxa"/>
+            </w:tcMar>
+          </w:tcPr>
+          <w:p>
+            <w:pPr>
+              <w:spacing w:after="40" w:before="0" w:line="264" w:lineRule="auto"/>
+            </w:pPr>
+            <w:r/>
+            <w:r>
+              <w:rPr>
+                <w:b w:val="0"/>
+                <w:color w:val="203448"/>
+                <w:sz w:val="20"/>
+              </w:rPr>
+              <w:t>顺序</w:t>
+            </w:r>
+          </w:p>
+        </w:tc>
+        <w:tc>
+          <w:tcPr>
+            <w:tcW w:type="dxa" w:w="4025"/>
+            <w:vAlign w:val="center"/>
+            <w:shd w:fill="EEF5FB"/>
+            <w:tcMar>
+              <w:top w:w="50" w:type="dxa"/>
+              <w:left w:w="100" w:type="dxa"/>
+              <w:bottom w:w="50" w:type="dxa"/>
+              <w:right w:w="100" w:type="dxa"/>
+            </w:tcMar>
+          </w:tcPr>
+          <w:p>
+            <w:pPr>
+              <w:spacing w:after="40" w:before="0" w:line="264" w:lineRule="auto"/>
+            </w:pPr>
+            <w:r/>
+            <w:r>
+              <w:rPr>
+                <w:b w:val="0"/>
+                <w:color w:val="203448"/>
+                <w:sz w:val="20"/>
+              </w:rPr>
+              <w:t>Firstly, / Finally,</w:t>
+              <w:br/>
+              <w:t>引出第一点和最后一点</w:t>
+            </w:r>
+          </w:p>
+        </w:tc>
+        <w:tc>
+          <w:tcPr>
+            <w:tcW w:type="dxa" w:w="4932"/>
+            <w:vAlign w:val="center"/>
+            <w:shd w:fill="EEF5FB"/>
+            <w:tcMar>
+              <w:top w:w="50" w:type="dxa"/>
+              <w:left w:w="100" w:type="dxa"/>
+              <w:bottom w:w="50" w:type="dxa"/>
+              <w:right w:w="100" w:type="dxa"/>
+            </w:tcMar>
+          </w:tcPr>
+          <w:p>
+            <w:pPr>
+              <w:spacing w:after="40" w:before="0" w:line="264" w:lineRule="auto"/>
+            </w:pPr>
+            <w:r/>
+            <w:r>
+              <w:rPr>
+                <w:b w:val="0"/>
+                <w:color w:val="203448"/>
+                <w:sz w:val="20"/>
+              </w:rPr>
+              <w:t>Firstly, it is a great way to spend time with friends.</w:t>
+              <w:br/>
+              <w:t>Finally, a short game helps us relax.</w:t>
             </w:r>
           </w:p>
         </w:tc>

</xml_diff>